<commit_message>
Implemented a pipeline that demonstrate BFS.
</commit_message>
<xml_diff>
--- a/Assignment 1/COMP237_Assign1_Analysis_Report.docx
+++ b/Assignment 1/COMP237_Assign1_Analysis_Report.docx
@@ -309,12 +309,16 @@
         <w:rPr>
           <w:b w:val="1"/>
           <w:bCs w:val="1"/>
+          <w:sz w:val="28"/>
+          <w:szCs w:val="28"/>
         </w:rPr>
       </w:pPr>
       <w:r>
         <w:rPr>
           <w:b w:val="1"/>
           <w:bCs w:val="1"/>
+          <w:sz w:val="28"/>
+          <w:szCs w:val="28"/>
           <w:rtl w:val="0"/>
         </w:rPr>
         <w:t xml:space="preserve">Changes to the code:</w:t>
@@ -1619,12 +1623,12 @@
           <wp:inline distB="114300" distT="114300" distL="114300" distR="114300">
             <wp:extent cx="6805613" cy="2486025"/>
             <wp:effectExtent b="0" l="0" r="0" t="0"/>
-            <wp:docPr id="1" name="image1.png"/>
+            <wp:docPr id="1" name="image2.png"/>
             <a:graphic>
               <a:graphicData uri="http://schemas.openxmlformats.org/drawingml/2006/picture">
                 <pic:pic>
                   <pic:nvPicPr>
-                    <pic:cNvPr id="0" name="image1.png"/>
+                    <pic:cNvPr id="0" name="image2.png"/>
                     <pic:cNvPicPr preferRelativeResize="0"/>
                   </pic:nvPicPr>
                   <pic:blipFill>
@@ -2830,9 +2834,44 @@
     </w:p>
     <w:p>
       <w:pPr>
-        <w:ind w:left="720" w:firstLine="0"/>
+        <w:ind w:left="-1260" w:firstLine="0"/>
         <w:rPr/>
       </w:pPr>
+      <w:r>
+        <w:rPr/>
+        <w:drawing>
+          <wp:inline distB="114300" distT="114300" distL="114300" distR="114300">
+            <wp:extent cx="8953943" cy="1563188"/>
+            <wp:effectExtent b="0" l="0" r="0" t="0"/>
+            <wp:docPr id="2" name="image1.png"/>
+            <a:graphic>
+              <a:graphicData uri="http://schemas.openxmlformats.org/drawingml/2006/picture">
+                <pic:pic>
+                  <pic:nvPicPr>
+                    <pic:cNvPr id="0" name="image1.png"/>
+                    <pic:cNvPicPr preferRelativeResize="0"/>
+                  </pic:nvPicPr>
+                  <pic:blipFill>
+                    <a:blip r:embed="rId7"/>
+                    <a:srcRect b="0" l="0" r="0" t="0"/>
+                    <a:stretch>
+                      <a:fillRect/>
+                    </a:stretch>
+                  </pic:blipFill>
+                  <pic:spPr>
+                    <a:xfrm>
+                      <a:off x="0" y="0"/>
+                      <a:ext cx="8953943" cy="1563188"/>
+                    </a:xfrm>
+                    <a:prstGeom prst="rect"/>
+                    <a:ln/>
+                  </pic:spPr>
+                </pic:pic>
+              </a:graphicData>
+            </a:graphic>
+          </wp:inline>
+        </w:drawing>
+      </w:r>
       <w:r>
         <w:rPr>
           <w:rtl w:val="0"/>

</xml_diff>